<commit_message>
Feedback questions file: remove the Code column from every table
The question codes are for the database, not for a reader. The tables now show the question,
its answer type and the comments column; the "(R)" of the 6 reverse-scored statements moved into
the Answer column, so every question still reads word for word. 56 questions checked against
feedbackTypes.ts; 5 pages.

Co-Authored-By: Claude Opus 5.5 <noreply@anthropic.com>
</commit_message>
<xml_diff>
--- a/docs/VRDS_Experiment2_Feedback_Questions.docx
+++ b/docs/VRDS_Experiment2_Feedback_Questions.docx
@@ -189,10 +189,10 @@
             <w:r/>
             <w:r>
               <w:rPr>
-                <w:b/>
+                <w:b w:val="0"/>
                 <w:i w:val="0"/>
                 <w:color w:val="262626"/>
-                <w:sz w:val="19"/>
+                <w:sz w:val="20"/>
               </w:rPr>
               <w:t>1. The reflection step (CVR)</w:t>
             </w:r>
@@ -213,7 +213,7 @@
                 <w:b w:val="0"/>
                 <w:i w:val="0"/>
                 <w:color w:val="262626"/>
-                <w:sz w:val="20"/>
+                <w:sz w:val="19"/>
               </w:rPr>
               <w:t>Participants who met a reflection</w:t>
             </w:r>
@@ -278,10 +278,10 @@
             <w:r/>
             <w:r>
               <w:rPr>
-                <w:b/>
+                <w:b w:val="0"/>
                 <w:i w:val="0"/>
                 <w:color w:val="262626"/>
-                <w:sz w:val="19"/>
+                <w:sz w:val="20"/>
               </w:rPr>
               <w:t>2. The clarification step (APA)</w:t>
             </w:r>
@@ -302,7 +302,7 @@
                 <w:b w:val="0"/>
                 <w:i w:val="0"/>
                 <w:color w:val="262626"/>
-                <w:sz w:val="20"/>
+                <w:sz w:val="19"/>
               </w:rPr>
               <w:t>Participants who used the clarification step</w:t>
             </w:r>
@@ -367,10 +367,10 @@
             <w:r/>
             <w:r>
               <w:rPr>
-                <w:b/>
+                <w:b w:val="0"/>
                 <w:i w:val="0"/>
                 <w:color w:val="262626"/>
-                <w:sz w:val="19"/>
+                <w:sz w:val="20"/>
               </w:rPr>
               <w:t>3. The tools and the experiment design</w:t>
             </w:r>
@@ -391,7 +391,7 @@
                 <w:b w:val="0"/>
                 <w:i w:val="0"/>
                 <w:color w:val="262626"/>
-                <w:sz w:val="20"/>
+                <w:sz w:val="19"/>
               </w:rPr>
               <w:t>Everyone</w:t>
             </w:r>
@@ -456,10 +456,10 @@
             <w:r/>
             <w:r>
               <w:rPr>
-                <w:b/>
+                <w:b w:val="0"/>
                 <w:i w:val="0"/>
                 <w:color w:val="262626"/>
-                <w:sz w:val="19"/>
+                <w:sz w:val="20"/>
               </w:rPr>
               <w:t>4. How this experience was for you</w:t>
             </w:r>
@@ -480,7 +480,7 @@
                 <w:b w:val="0"/>
                 <w:i w:val="0"/>
                 <w:color w:val="262626"/>
-                <w:sz w:val="20"/>
+                <w:sz w:val="19"/>
               </w:rPr>
               <w:t>Everyone</w:t>
             </w:r>
@@ -576,10 +576,9 @@
         </w:tblBorders>
       </w:tblPr>
       <w:tblGrid>
-        <w:gridCol w:w="1584"/>
-        <w:gridCol w:w="4464"/>
+        <w:gridCol w:w="5328"/>
         <w:gridCol w:w="1872"/>
-        <w:gridCol w:w="2016"/>
+        <w:gridCol w:w="2736"/>
       </w:tblGrid>
       <w:tr>
         <w:trPr>
@@ -588,29 +587,7 @@
         </w:trPr>
         <w:tc>
           <w:tcPr>
-            <w:tcW w:type="dxa" w:w="1584"/>
-            <w:vAlign w:val="center"/>
-            <w:shd w:val="clear" w:color="auto" w:fill="DCE6F1"/>
-          </w:tcPr>
-          <w:p>
-            <w:pPr>
-              <w:spacing w:after="20" w:before="20"/>
-            </w:pPr>
-            <w:r/>
-            <w:r>
-              <w:rPr>
-                <w:b/>
-                <w:i w:val="0"/>
-                <w:color w:val="1F3864"/>
-                <w:sz w:val="20"/>
-              </w:rPr>
-              <w:t>Code</w:t>
-            </w:r>
-          </w:p>
-        </w:tc>
-        <w:tc>
-          <w:tcPr>
-            <w:tcW w:type="dxa" w:w="4464"/>
+            <w:tcW w:type="dxa" w:w="5328"/>
             <w:vAlign w:val="center"/>
             <w:shd w:val="clear" w:color="auto" w:fill="DCE6F1"/>
           </w:tcPr>
@@ -654,7 +631,7 @@
         </w:tc>
         <w:tc>
           <w:tcPr>
-            <w:tcW w:type="dxa" w:w="2016"/>
+            <w:tcW w:type="dxa" w:w="2736"/>
             <w:vAlign w:val="center"/>
             <w:shd w:val="clear" w:color="auto" w:fill="DCE6F1"/>
           </w:tcPr>
@@ -681,28 +658,7 @@
         </w:trPr>
         <w:tc>
           <w:tcPr>
-            <w:tcW w:type="dxa" w:w="1584"/>
-            <w:vAlign w:val="center"/>
-          </w:tcPr>
-          <w:p>
-            <w:pPr>
-              <w:spacing w:after="20" w:before="20"/>
-            </w:pPr>
-            <w:r/>
-            <w:r>
-              <w:rPr>
-                <w:b/>
-                <w:i w:val="0"/>
-                <w:color w:val="262626"/>
-                <w:sz w:val="17"/>
-              </w:rPr>
-              <w:t>CVR_​helped</w:t>
-            </w:r>
-          </w:p>
-        </w:tc>
-        <w:tc>
-          <w:tcPr>
-            <w:tcW w:type="dxa" w:w="4464"/>
+            <w:tcW w:type="dxa" w:w="5328"/>
             <w:vAlign w:val="center"/>
           </w:tcPr>
           <w:p>
@@ -744,7 +700,7 @@
         </w:tc>
         <w:tc>
           <w:tcPr>
-            <w:tcW w:type="dxa" w:w="2016"/>
+            <w:tcW w:type="dxa" w:w="2736"/>
             <w:vAlign w:val="center"/>
           </w:tcPr>
           <w:p>
@@ -769,28 +725,7 @@
         </w:trPr>
         <w:tc>
           <w:tcPr>
-            <w:tcW w:type="dxa" w:w="1584"/>
-            <w:vAlign w:val="center"/>
-          </w:tcPr>
-          <w:p>
-            <w:pPr>
-              <w:spacing w:after="20" w:before="20"/>
-            </w:pPr>
-            <w:r/>
-            <w:r>
-              <w:rPr>
-                <w:b/>
-                <w:i w:val="0"/>
-                <w:color w:val="262626"/>
-                <w:sz w:val="17"/>
-              </w:rPr>
-              <w:t>CVR_​reconsider</w:t>
-            </w:r>
-          </w:p>
-        </w:tc>
-        <w:tc>
-          <w:tcPr>
-            <w:tcW w:type="dxa" w:w="4464"/>
+            <w:tcW w:type="dxa" w:w="5328"/>
             <w:vAlign w:val="center"/>
           </w:tcPr>
           <w:p>
@@ -832,7 +767,7 @@
         </w:tc>
         <w:tc>
           <w:tcPr>
-            <w:tcW w:type="dxa" w:w="2016"/>
+            <w:tcW w:type="dxa" w:w="2736"/>
             <w:vAlign w:val="center"/>
           </w:tcPr>
           <w:p>
@@ -857,28 +792,7 @@
         </w:trPr>
         <w:tc>
           <w:tcPr>
-            <w:tcW w:type="dxa" w:w="1584"/>
-            <w:vAlign w:val="center"/>
-          </w:tcPr>
-          <w:p>
-            <w:pPr>
-              <w:spacing w:after="20" w:before="20"/>
-            </w:pPr>
-            <w:r/>
-            <w:r>
-              <w:rPr>
-                <w:b/>
-                <w:i w:val="0"/>
-                <w:color w:val="262626"/>
-                <w:sz w:val="17"/>
-              </w:rPr>
-              <w:t>CVR_​clear</w:t>
-            </w:r>
-          </w:p>
-        </w:tc>
-        <w:tc>
-          <w:tcPr>
-            <w:tcW w:type="dxa" w:w="4464"/>
+            <w:tcW w:type="dxa" w:w="5328"/>
             <w:vAlign w:val="center"/>
           </w:tcPr>
           <w:p>
@@ -920,7 +834,7 @@
         </w:tc>
         <w:tc>
           <w:tcPr>
-            <w:tcW w:type="dxa" w:w="2016"/>
+            <w:tcW w:type="dxa" w:w="2736"/>
             <w:vAlign w:val="center"/>
           </w:tcPr>
           <w:p>
@@ -945,28 +859,7 @@
         </w:trPr>
         <w:tc>
           <w:tcPr>
-            <w:tcW w:type="dxa" w:w="1584"/>
-            <w:vAlign w:val="center"/>
-          </w:tcPr>
-          <w:p>
-            <w:pPr>
-              <w:spacing w:after="20" w:before="20"/>
-            </w:pPr>
-            <w:r/>
-            <w:r>
-              <w:rPr>
-                <w:b/>
-                <w:i w:val="0"/>
-                <w:color w:val="262626"/>
-                <w:sz w:val="17"/>
-              </w:rPr>
-              <w:t>CVR_​useful</w:t>
-            </w:r>
-          </w:p>
-        </w:tc>
-        <w:tc>
-          <w:tcPr>
-            <w:tcW w:type="dxa" w:w="4464"/>
+            <w:tcW w:type="dxa" w:w="5328"/>
             <w:vAlign w:val="center"/>
           </w:tcPr>
           <w:p>
@@ -1008,7 +901,7 @@
         </w:tc>
         <w:tc>
           <w:tcPr>
-            <w:tcW w:type="dxa" w:w="2016"/>
+            <w:tcW w:type="dxa" w:w="2736"/>
             <w:vAlign w:val="center"/>
           </w:tcPr>
           <w:p>
@@ -1033,28 +926,7 @@
         </w:trPr>
         <w:tc>
           <w:tcPr>
-            <w:tcW w:type="dxa" w:w="1584"/>
-            <w:vAlign w:val="center"/>
-          </w:tcPr>
-          <w:p>
-            <w:pPr>
-              <w:spacing w:after="20" w:before="20"/>
-            </w:pPr>
-            <w:r/>
-            <w:r>
-              <w:rPr>
-                <w:b/>
-                <w:i w:val="0"/>
-                <w:color w:val="262626"/>
-                <w:sz w:val="17"/>
-              </w:rPr>
-              <w:t>CVR_​confusing</w:t>
-            </w:r>
-          </w:p>
-        </w:tc>
-        <w:tc>
-          <w:tcPr>
-            <w:tcW w:type="dxa" w:w="4464"/>
+            <w:tcW w:type="dxa" w:w="5328"/>
             <w:vAlign w:val="center"/>
           </w:tcPr>
           <w:p>
@@ -1096,7 +968,7 @@
         </w:tc>
         <w:tc>
           <w:tcPr>
-            <w:tcW w:type="dxa" w:w="2016"/>
+            <w:tcW w:type="dxa" w:w="2736"/>
             <w:vAlign w:val="center"/>
           </w:tcPr>
           <w:p>
@@ -1121,28 +993,7 @@
         </w:trPr>
         <w:tc>
           <w:tcPr>
-            <w:tcW w:type="dxa" w:w="1584"/>
-            <w:vAlign w:val="center"/>
-          </w:tcPr>
-          <w:p>
-            <w:pPr>
-              <w:spacing w:after="20" w:before="20"/>
-            </w:pPr>
-            <w:r/>
-            <w:r>
-              <w:rPr>
-                <w:b/>
-                <w:i w:val="0"/>
-                <w:color w:val="262626"/>
-                <w:sz w:val="17"/>
-              </w:rPr>
-              <w:t>CVR_​confidence</w:t>
-            </w:r>
-          </w:p>
-        </w:tc>
-        <w:tc>
-          <w:tcPr>
-            <w:tcW w:type="dxa" w:w="4464"/>
+            <w:tcW w:type="dxa" w:w="5328"/>
             <w:vAlign w:val="center"/>
           </w:tcPr>
           <w:p>
@@ -1184,7 +1035,7 @@
         </w:tc>
         <w:tc>
           <w:tcPr>
-            <w:tcW w:type="dxa" w:w="2016"/>
+            <w:tcW w:type="dxa" w:w="2736"/>
             <w:vAlign w:val="center"/>
           </w:tcPr>
           <w:p>
@@ -1209,28 +1060,7 @@
         </w:trPr>
         <w:tc>
           <w:tcPr>
-            <w:tcW w:type="dxa" w:w="1584"/>
-            <w:vAlign w:val="center"/>
-          </w:tcPr>
-          <w:p>
-            <w:pPr>
-              <w:spacing w:after="20" w:before="20"/>
-            </w:pPr>
-            <w:r/>
-            <w:r>
-              <w:rPr>
-                <w:b/>
-                <w:i w:val="0"/>
-                <w:color w:val="262626"/>
-                <w:sz w:val="17"/>
-              </w:rPr>
-              <w:t>CVR_​changed</w:t>
-            </w:r>
-          </w:p>
-        </w:tc>
-        <w:tc>
-          <w:tcPr>
-            <w:tcW w:type="dxa" w:w="4464"/>
+            <w:tcW w:type="dxa" w:w="5328"/>
             <w:vAlign w:val="center"/>
           </w:tcPr>
           <w:p>
@@ -1272,7 +1102,7 @@
         </w:tc>
         <w:tc>
           <w:tcPr>
-            <w:tcW w:type="dxa" w:w="2016"/>
+            <w:tcW w:type="dxa" w:w="2736"/>
             <w:vAlign w:val="center"/>
           </w:tcPr>
           <w:p>
@@ -1297,28 +1127,7 @@
         </w:trPr>
         <w:tc>
           <w:tcPr>
-            <w:tcW w:type="dxa" w:w="1584"/>
-            <w:vAlign w:val="center"/>
-          </w:tcPr>
-          <w:p>
-            <w:pPr>
-              <w:spacing w:after="20" w:before="20"/>
-            </w:pPr>
-            <w:r/>
-            <w:r>
-              <w:rPr>
-                <w:b/>
-                <w:i w:val="0"/>
-                <w:color w:val="262626"/>
-                <w:sz w:val="17"/>
-              </w:rPr>
-              <w:t>CVR_​open</w:t>
-            </w:r>
-          </w:p>
-        </w:tc>
-        <w:tc>
-          <w:tcPr>
-            <w:tcW w:type="dxa" w:w="4464"/>
+            <w:tcW w:type="dxa" w:w="5328"/>
             <w:vAlign w:val="center"/>
           </w:tcPr>
           <w:p>
@@ -1360,7 +1169,7 @@
         </w:tc>
         <w:tc>
           <w:tcPr>
-            <w:tcW w:type="dxa" w:w="2016"/>
+            <w:tcW w:type="dxa" w:w="2736"/>
             <w:vAlign w:val="center"/>
           </w:tcPr>
           <w:p>
@@ -1386,7 +1195,7 @@
         <w:tc>
           <w:tcPr>
             <w:tcW w:type="dxa" w:w="9936"/>
-            <w:gridSpan w:val="4"/>
+            <w:gridSpan w:val="3"/>
             <w:vAlign w:val="center"/>
             <w:shd w:val="clear" w:color="auto" w:fill="F2F2F2"/>
           </w:tcPr>
@@ -1414,28 +1223,7 @@
         </w:trPr>
         <w:tc>
           <w:tcPr>
-            <w:tcW w:type="dxa" w:w="1584"/>
-            <w:vAlign w:val="center"/>
-          </w:tcPr>
-          <w:p>
-            <w:pPr>
-              <w:spacing w:after="20" w:before="20"/>
-            </w:pPr>
-            <w:r/>
-            <w:r>
-              <w:rPr>
-                <w:b/>
-                <w:i w:val="0"/>
-                <w:color w:val="262626"/>
-                <w:sz w:val="17"/>
-              </w:rPr>
-              <w:t>CVR_​dual_​helpful</w:t>
-            </w:r>
-          </w:p>
-        </w:tc>
-        <w:tc>
-          <w:tcPr>
-            <w:tcW w:type="dxa" w:w="4464"/>
+            <w:tcW w:type="dxa" w:w="5328"/>
             <w:vAlign w:val="center"/>
           </w:tcPr>
           <w:p>
@@ -1477,7 +1265,7 @@
         </w:tc>
         <w:tc>
           <w:tcPr>
-            <w:tcW w:type="dxa" w:w="2016"/>
+            <w:tcW w:type="dxa" w:w="2736"/>
             <w:vAlign w:val="center"/>
           </w:tcPr>
           <w:p>
@@ -1502,28 +1290,7 @@
         </w:trPr>
         <w:tc>
           <w:tcPr>
-            <w:tcW w:type="dxa" w:w="1584"/>
-            <w:vAlign w:val="center"/>
-          </w:tcPr>
-          <w:p>
-            <w:pPr>
-              <w:spacing w:after="20" w:before="20"/>
-            </w:pPr>
-            <w:r/>
-            <w:r>
-              <w:rPr>
-                <w:b/>
-                <w:i w:val="0"/>
-                <w:color w:val="262626"/>
-                <w:sz w:val="17"/>
-              </w:rPr>
-              <w:t>CVR_​dual_​changed</w:t>
-            </w:r>
-          </w:p>
-        </w:tc>
-        <w:tc>
-          <w:tcPr>
-            <w:tcW w:type="dxa" w:w="4464"/>
+            <w:tcW w:type="dxa" w:w="5328"/>
             <w:vAlign w:val="center"/>
           </w:tcPr>
           <w:p>
@@ -1565,7 +1332,7 @@
         </w:tc>
         <w:tc>
           <w:tcPr>
-            <w:tcW w:type="dxa" w:w="2016"/>
+            <w:tcW w:type="dxa" w:w="2736"/>
             <w:vAlign w:val="center"/>
           </w:tcPr>
           <w:p>
@@ -1631,10 +1398,9 @@
         </w:tblBorders>
       </w:tblPr>
       <w:tblGrid>
-        <w:gridCol w:w="1584"/>
-        <w:gridCol w:w="4464"/>
+        <w:gridCol w:w="5328"/>
         <w:gridCol w:w="1872"/>
-        <w:gridCol w:w="2016"/>
+        <w:gridCol w:w="2736"/>
       </w:tblGrid>
       <w:tr>
         <w:trPr>
@@ -1643,29 +1409,7 @@
         </w:trPr>
         <w:tc>
           <w:tcPr>
-            <w:tcW w:type="dxa" w:w="1584"/>
-            <w:vAlign w:val="center"/>
-            <w:shd w:val="clear" w:color="auto" w:fill="DCE6F1"/>
-          </w:tcPr>
-          <w:p>
-            <w:pPr>
-              <w:spacing w:after="20" w:before="20"/>
-            </w:pPr>
-            <w:r/>
-            <w:r>
-              <w:rPr>
-                <w:b/>
-                <w:i w:val="0"/>
-                <w:color w:val="1F3864"/>
-                <w:sz w:val="20"/>
-              </w:rPr>
-              <w:t>Code</w:t>
-            </w:r>
-          </w:p>
-        </w:tc>
-        <w:tc>
-          <w:tcPr>
-            <w:tcW w:type="dxa" w:w="4464"/>
+            <w:tcW w:type="dxa" w:w="5328"/>
             <w:vAlign w:val="center"/>
             <w:shd w:val="clear" w:color="auto" w:fill="DCE6F1"/>
           </w:tcPr>
@@ -1709,7 +1453,7 @@
         </w:tc>
         <w:tc>
           <w:tcPr>
-            <w:tcW w:type="dxa" w:w="2016"/>
+            <w:tcW w:type="dxa" w:w="2736"/>
             <w:vAlign w:val="center"/>
             <w:shd w:val="clear" w:color="auto" w:fill="DCE6F1"/>
           </w:tcPr>
@@ -1736,28 +1480,7 @@
         </w:trPr>
         <w:tc>
           <w:tcPr>
-            <w:tcW w:type="dxa" w:w="1584"/>
-            <w:vAlign w:val="center"/>
-          </w:tcPr>
-          <w:p>
-            <w:pPr>
-              <w:spacing w:after="20" w:before="20"/>
-            </w:pPr>
-            <w:r/>
-            <w:r>
-              <w:rPr>
-                <w:b/>
-                <w:i w:val="0"/>
-                <w:color w:val="262626"/>
-                <w:sz w:val="17"/>
-              </w:rPr>
-              <w:t>APA_​clarify</w:t>
-            </w:r>
-          </w:p>
-        </w:tc>
-        <w:tc>
-          <w:tcPr>
-            <w:tcW w:type="dxa" w:w="4464"/>
+            <w:tcW w:type="dxa" w:w="5328"/>
             <w:vAlign w:val="center"/>
           </w:tcPr>
           <w:p>
@@ -1799,7 +1522,7 @@
         </w:tc>
         <w:tc>
           <w:tcPr>
-            <w:tcW w:type="dxa" w:w="2016"/>
+            <w:tcW w:type="dxa" w:w="2736"/>
             <w:vAlign w:val="center"/>
           </w:tcPr>
           <w:p>
@@ -1824,28 +1547,7 @@
         </w:trPr>
         <w:tc>
           <w:tcPr>
-            <w:tcW w:type="dxa" w:w="1584"/>
-            <w:vAlign w:val="center"/>
-          </w:tcPr>
-          <w:p>
-            <w:pPr>
-              <w:spacing w:after="20" w:before="20"/>
-            </w:pPr>
-            <w:r/>
-            <w:r>
-              <w:rPr>
-                <w:b/>
-                <w:i w:val="0"/>
-                <w:color w:val="262626"/>
-                <w:sz w:val="17"/>
-              </w:rPr>
-              <w:t>APA_​tradeoff</w:t>
-            </w:r>
-          </w:p>
-        </w:tc>
-        <w:tc>
-          <w:tcPr>
-            <w:tcW w:type="dxa" w:w="4464"/>
+            <w:tcW w:type="dxa" w:w="5328"/>
             <w:vAlign w:val="center"/>
           </w:tcPr>
           <w:p>
@@ -1887,7 +1589,7 @@
         </w:tc>
         <w:tc>
           <w:tcPr>
-            <w:tcW w:type="dxa" w:w="2016"/>
+            <w:tcW w:type="dxa" w:w="2736"/>
             <w:vAlign w:val="center"/>
           </w:tcPr>
           <w:p>
@@ -1912,28 +1614,7 @@
         </w:trPr>
         <w:tc>
           <w:tcPr>
-            <w:tcW w:type="dxa" w:w="1584"/>
-            <w:vAlign w:val="center"/>
-          </w:tcPr>
-          <w:p>
-            <w:pPr>
-              <w:spacing w:after="20" w:before="20"/>
-            </w:pPr>
-            <w:r/>
-            <w:r>
-              <w:rPr>
-                <w:b/>
-                <w:i w:val="0"/>
-                <w:color w:val="262626"/>
-                <w:sz w:val="17"/>
-              </w:rPr>
-              <w:t>APA_​clear</w:t>
-            </w:r>
-          </w:p>
-        </w:tc>
-        <w:tc>
-          <w:tcPr>
-            <w:tcW w:type="dxa" w:w="4464"/>
+            <w:tcW w:type="dxa" w:w="5328"/>
             <w:vAlign w:val="center"/>
           </w:tcPr>
           <w:p>
@@ -1975,7 +1656,7 @@
         </w:tc>
         <w:tc>
           <w:tcPr>
-            <w:tcW w:type="dxa" w:w="2016"/>
+            <w:tcW w:type="dxa" w:w="2736"/>
             <w:vAlign w:val="center"/>
           </w:tcPr>
           <w:p>
@@ -2000,28 +1681,7 @@
         </w:trPr>
         <w:tc>
           <w:tcPr>
-            <w:tcW w:type="dxa" w:w="1584"/>
-            <w:vAlign w:val="center"/>
-          </w:tcPr>
-          <w:p>
-            <w:pPr>
-              <w:spacing w:after="20" w:before="20"/>
-            </w:pPr>
-            <w:r/>
-            <w:r>
-              <w:rPr>
-                <w:b/>
-                <w:i w:val="0"/>
-                <w:color w:val="262626"/>
-                <w:sz w:val="17"/>
-              </w:rPr>
-              <w:t>APA_​prioritization</w:t>
-            </w:r>
-          </w:p>
-        </w:tc>
-        <w:tc>
-          <w:tcPr>
-            <w:tcW w:type="dxa" w:w="4464"/>
+            <w:tcW w:type="dxa" w:w="5328"/>
             <w:vAlign w:val="center"/>
           </w:tcPr>
           <w:p>
@@ -2063,7 +1723,7 @@
         </w:tc>
         <w:tc>
           <w:tcPr>
-            <w:tcW w:type="dxa" w:w="2016"/>
+            <w:tcW w:type="dxa" w:w="2736"/>
             <w:vAlign w:val="center"/>
           </w:tcPr>
           <w:p>
@@ -2088,28 +1748,7 @@
         </w:trPr>
         <w:tc>
           <w:tcPr>
-            <w:tcW w:type="dxa" w:w="1584"/>
-            <w:vAlign w:val="center"/>
-          </w:tcPr>
-          <w:p>
-            <w:pPr>
-              <w:spacing w:after="20" w:before="20"/>
-            </w:pPr>
-            <w:r/>
-            <w:r>
-              <w:rPr>
-                <w:b/>
-                <w:i w:val="0"/>
-                <w:color w:val="262626"/>
-                <w:sz w:val="17"/>
-              </w:rPr>
-              <w:t>APA_​better</w:t>
-            </w:r>
-          </w:p>
-        </w:tc>
-        <w:tc>
-          <w:tcPr>
-            <w:tcW w:type="dxa" w:w="4464"/>
+            <w:tcW w:type="dxa" w:w="5328"/>
             <w:vAlign w:val="center"/>
           </w:tcPr>
           <w:p>
@@ -2151,7 +1790,7 @@
         </w:tc>
         <w:tc>
           <w:tcPr>
-            <w:tcW w:type="dxa" w:w="2016"/>
+            <w:tcW w:type="dxa" w:w="2736"/>
             <w:vAlign w:val="center"/>
           </w:tcPr>
           <w:p>
@@ -2176,28 +1815,7 @@
         </w:trPr>
         <w:tc>
           <w:tcPr>
-            <w:tcW w:type="dxa" w:w="1584"/>
-            <w:vAlign w:val="center"/>
-          </w:tcPr>
-          <w:p>
-            <w:pPr>
-              <w:spacing w:after="20" w:before="20"/>
-            </w:pPr>
-            <w:r/>
-            <w:r>
-              <w:rPr>
-                <w:b/>
-                <w:i w:val="0"/>
-                <w:color w:val="262626"/>
-                <w:sz w:val="17"/>
-              </w:rPr>
-              <w:t>APA_​toolong</w:t>
-            </w:r>
-          </w:p>
-        </w:tc>
-        <w:tc>
-          <w:tcPr>
-            <w:tcW w:type="dxa" w:w="4464"/>
+            <w:tcW w:type="dxa" w:w="5328"/>
             <w:vAlign w:val="center"/>
           </w:tcPr>
           <w:p>
@@ -2239,7 +1857,7 @@
         </w:tc>
         <w:tc>
           <w:tcPr>
-            <w:tcW w:type="dxa" w:w="2016"/>
+            <w:tcW w:type="dxa" w:w="2736"/>
             <w:vAlign w:val="center"/>
           </w:tcPr>
           <w:p>
@@ -2264,28 +1882,7 @@
         </w:trPr>
         <w:tc>
           <w:tcPr>
-            <w:tcW w:type="dxa" w:w="1584"/>
-            <w:vAlign w:val="center"/>
-          </w:tcPr>
-          <w:p>
-            <w:pPr>
-              <w:spacing w:after="20" w:before="20"/>
-            </w:pPr>
-            <w:r/>
-            <w:r>
-              <w:rPr>
-                <w:b/>
-                <w:i w:val="0"/>
-                <w:color w:val="262626"/>
-                <w:sz w:val="17"/>
-              </w:rPr>
-              <w:t>APA_​confidence_​helpful</w:t>
-            </w:r>
-          </w:p>
-        </w:tc>
-        <w:tc>
-          <w:tcPr>
-            <w:tcW w:type="dxa" w:w="4464"/>
+            <w:tcW w:type="dxa" w:w="5328"/>
             <w:vAlign w:val="center"/>
           </w:tcPr>
           <w:p>
@@ -2327,7 +1924,7 @@
         </w:tc>
         <w:tc>
           <w:tcPr>
-            <w:tcW w:type="dxa" w:w="2016"/>
+            <w:tcW w:type="dxa" w:w="2736"/>
             <w:vAlign w:val="center"/>
           </w:tcPr>
           <w:p>
@@ -2352,28 +1949,7 @@
         </w:trPr>
         <w:tc>
           <w:tcPr>
-            <w:tcW w:type="dxa" w:w="1584"/>
-            <w:vAlign w:val="center"/>
-          </w:tcPr>
-          <w:p>
-            <w:pPr>
-              <w:spacing w:after="20" w:before="20"/>
-            </w:pPr>
-            <w:r/>
-            <w:r>
-              <w:rPr>
-                <w:b/>
-                <w:i w:val="0"/>
-                <w:color w:val="262626"/>
-                <w:sz w:val="17"/>
-              </w:rPr>
-              <w:t>APA_​open</w:t>
-            </w:r>
-          </w:p>
-        </w:tc>
-        <w:tc>
-          <w:tcPr>
-            <w:tcW w:type="dxa" w:w="4464"/>
+            <w:tcW w:type="dxa" w:w="5328"/>
             <w:vAlign w:val="center"/>
           </w:tcPr>
           <w:p>
@@ -2415,7 +1991,7 @@
         </w:tc>
         <w:tc>
           <w:tcPr>
-            <w:tcW w:type="dxa" w:w="2016"/>
+            <w:tcW w:type="dxa" w:w="2736"/>
             <w:vAlign w:val="center"/>
           </w:tcPr>
           <w:p>
@@ -2481,10 +2057,9 @@
         </w:tblBorders>
       </w:tblPr>
       <w:tblGrid>
-        <w:gridCol w:w="1584"/>
-        <w:gridCol w:w="4464"/>
+        <w:gridCol w:w="5328"/>
         <w:gridCol w:w="1872"/>
-        <w:gridCol w:w="2016"/>
+        <w:gridCol w:w="2736"/>
       </w:tblGrid>
       <w:tr>
         <w:trPr>
@@ -2493,29 +2068,7 @@
         </w:trPr>
         <w:tc>
           <w:tcPr>
-            <w:tcW w:type="dxa" w:w="1584"/>
-            <w:vAlign w:val="center"/>
-            <w:shd w:val="clear" w:color="auto" w:fill="DCE6F1"/>
-          </w:tcPr>
-          <w:p>
-            <w:pPr>
-              <w:spacing w:after="20" w:before="20"/>
-            </w:pPr>
-            <w:r/>
-            <w:r>
-              <w:rPr>
-                <w:b/>
-                <w:i w:val="0"/>
-                <w:color w:val="1F3864"/>
-                <w:sz w:val="20"/>
-              </w:rPr>
-              <w:t>Code</w:t>
-            </w:r>
-          </w:p>
-        </w:tc>
-        <w:tc>
-          <w:tcPr>
-            <w:tcW w:type="dxa" w:w="4464"/>
+            <w:tcW w:type="dxa" w:w="5328"/>
             <w:vAlign w:val="center"/>
             <w:shd w:val="clear" w:color="auto" w:fill="DCE6F1"/>
           </w:tcPr>
@@ -2559,7 +2112,7 @@
         </w:tc>
         <w:tc>
           <w:tcPr>
-            <w:tcW w:type="dxa" w:w="2016"/>
+            <w:tcW w:type="dxa" w:w="2736"/>
             <w:vAlign w:val="center"/>
             <w:shd w:val="clear" w:color="auto" w:fill="DCE6F1"/>
           </w:tcPr>
@@ -2587,7 +2140,7 @@
         <w:tc>
           <w:tcPr>
             <w:tcW w:type="dxa" w:w="9936"/>
-            <w:gridSpan w:val="4"/>
+            <w:gridSpan w:val="3"/>
             <w:vAlign w:val="center"/>
             <w:shd w:val="clear" w:color="auto" w:fill="F2F2F2"/>
           </w:tcPr>
@@ -2615,28 +2168,7 @@
         </w:trPr>
         <w:tc>
           <w:tcPr>
-            <w:tcW w:type="dxa" w:w="1584"/>
-            <w:vAlign w:val="center"/>
-          </w:tcPr>
-          <w:p>
-            <w:pPr>
-              <w:spacing w:after="20" w:before="20"/>
-            </w:pPr>
-            <w:r/>
-            <w:r>
-              <w:rPr>
-                <w:b/>
-                <w:i w:val="0"/>
-                <w:color w:val="262626"/>
-                <w:sz w:val="17"/>
-              </w:rPr>
-              <w:t>TOOL_​optionCards</w:t>
-            </w:r>
-          </w:p>
-        </w:tc>
-        <w:tc>
-          <w:tcPr>
-            <w:tcW w:type="dxa" w:w="4464"/>
+            <w:tcW w:type="dxa" w:w="5328"/>
             <w:vAlign w:val="center"/>
           </w:tcPr>
           <w:p>
@@ -2678,7 +2210,7 @@
         </w:tc>
         <w:tc>
           <w:tcPr>
-            <w:tcW w:type="dxa" w:w="2016"/>
+            <w:tcW w:type="dxa" w:w="2736"/>
             <w:vAlign w:val="center"/>
           </w:tcPr>
           <w:p>
@@ -2703,28 +2235,7 @@
         </w:trPr>
         <w:tc>
           <w:tcPr>
-            <w:tcW w:type="dxa" w:w="1584"/>
-            <w:vAlign w:val="center"/>
-          </w:tcPr>
-          <w:p>
-            <w:pPr>
-              <w:spacing w:after="20" w:before="20"/>
-            </w:pPr>
-            <w:r/>
-            <w:r>
-              <w:rPr>
-                <w:b/>
-                <w:i w:val="0"/>
-                <w:color w:val="262626"/>
-                <w:sz w:val="17"/>
-              </w:rPr>
-              <w:t>TOOL_​consequences</w:t>
-            </w:r>
-          </w:p>
-        </w:tc>
-        <w:tc>
-          <w:tcPr>
-            <w:tcW w:type="dxa" w:w="4464"/>
+            <w:tcW w:type="dxa" w:w="5328"/>
             <w:vAlign w:val="center"/>
           </w:tcPr>
           <w:p>
@@ -2766,7 +2277,7 @@
         </w:tc>
         <w:tc>
           <w:tcPr>
-            <w:tcW w:type="dxa" w:w="2016"/>
+            <w:tcW w:type="dxa" w:w="2736"/>
             <w:vAlign w:val="center"/>
           </w:tcPr>
           <w:p>
@@ -2791,28 +2302,7 @@
         </w:trPr>
         <w:tc>
           <w:tcPr>
-            <w:tcW w:type="dxa" w:w="1584"/>
-            <w:vAlign w:val="center"/>
-          </w:tcPr>
-          <w:p>
-            <w:pPr>
-              <w:spacing w:after="20" w:before="20"/>
-            </w:pPr>
-            <w:r/>
-            <w:r>
-              <w:rPr>
-                <w:b/>
-                <w:i w:val="0"/>
-                <w:color w:val="262626"/>
-                <w:sz w:val="17"/>
-              </w:rPr>
-              <w:t>TOOL_​tradeoffs</w:t>
-            </w:r>
-          </w:p>
-        </w:tc>
-        <w:tc>
-          <w:tcPr>
-            <w:tcW w:type="dxa" w:w="4464"/>
+            <w:tcW w:type="dxa" w:w="5328"/>
             <w:vAlign w:val="center"/>
           </w:tcPr>
           <w:p>
@@ -2854,7 +2344,7 @@
         </w:tc>
         <w:tc>
           <w:tcPr>
-            <w:tcW w:type="dxa" w:w="2016"/>
+            <w:tcW w:type="dxa" w:w="2736"/>
             <w:vAlign w:val="center"/>
           </w:tcPr>
           <w:p>
@@ -2879,28 +2369,7 @@
         </w:trPr>
         <w:tc>
           <w:tcPr>
-            <w:tcW w:type="dxa" w:w="1584"/>
-            <w:vAlign w:val="center"/>
-          </w:tcPr>
-          <w:p>
-            <w:pPr>
-              <w:spacing w:after="20" w:before="20"/>
-            </w:pPr>
-            <w:r/>
-            <w:r>
-              <w:rPr>
-                <w:b/>
-                <w:i w:val="0"/>
-                <w:color w:val="262626"/>
-                <w:sz w:val="17"/>
-              </w:rPr>
-              <w:t>TOOL_​metricsDashboard</w:t>
-            </w:r>
-          </w:p>
-        </w:tc>
-        <w:tc>
-          <w:tcPr>
-            <w:tcW w:type="dxa" w:w="4464"/>
+            <w:tcW w:type="dxa" w:w="5328"/>
             <w:vAlign w:val="center"/>
           </w:tcPr>
           <w:p>
@@ -2942,7 +2411,7 @@
         </w:tc>
         <w:tc>
           <w:tcPr>
-            <w:tcW w:type="dxa" w:w="2016"/>
+            <w:tcW w:type="dxa" w:w="2736"/>
             <w:vAlign w:val="center"/>
           </w:tcPr>
           <w:p>
@@ -2967,28 +2436,7 @@
         </w:trPr>
         <w:tc>
           <w:tcPr>
-            <w:tcW w:type="dxa" w:w="1584"/>
-            <w:vAlign w:val="center"/>
-          </w:tcPr>
-          <w:p>
-            <w:pPr>
-              <w:spacing w:after="20" w:before="20"/>
-            </w:pPr>
-            <w:r/>
-            <w:r>
-              <w:rPr>
-                <w:b/>
-                <w:i w:val="0"/>
-                <w:color w:val="262626"/>
-                <w:sz w:val="17"/>
-              </w:rPr>
-              <w:t>TOOL_​previewImpact</w:t>
-            </w:r>
-          </w:p>
-        </w:tc>
-        <w:tc>
-          <w:tcPr>
-            <w:tcW w:type="dxa" w:w="4464"/>
+            <w:tcW w:type="dxa" w:w="5328"/>
             <w:vAlign w:val="center"/>
           </w:tcPr>
           <w:p>
@@ -3030,7 +2478,7 @@
         </w:tc>
         <w:tc>
           <w:tcPr>
-            <w:tcW w:type="dxa" w:w="2016"/>
+            <w:tcW w:type="dxa" w:w="2736"/>
             <w:vAlign w:val="center"/>
           </w:tcPr>
           <w:p>
@@ -3055,28 +2503,7 @@
         </w:trPr>
         <w:tc>
           <w:tcPr>
-            <w:tcW w:type="dxa" w:w="1584"/>
-            <w:vAlign w:val="center"/>
-          </w:tcPr>
-          <w:p>
-            <w:pPr>
-              <w:spacing w:after="20" w:before="20"/>
-            </w:pPr>
-            <w:r/>
-            <w:r>
-              <w:rPr>
-                <w:b/>
-                <w:i w:val="0"/>
-                <w:color w:val="262626"/>
-                <w:sz w:val="17"/>
-              </w:rPr>
-              <w:t>TOOL_​resultsPage</w:t>
-            </w:r>
-          </w:p>
-        </w:tc>
-        <w:tc>
-          <w:tcPr>
-            <w:tcW w:type="dxa" w:w="4464"/>
+            <w:tcW w:type="dxa" w:w="5328"/>
             <w:vAlign w:val="center"/>
           </w:tcPr>
           <w:p>
@@ -3118,7 +2545,7 @@
         </w:tc>
         <w:tc>
           <w:tcPr>
-            <w:tcW w:type="dxa" w:w="2016"/>
+            <w:tcW w:type="dxa" w:w="2736"/>
             <w:vAlign w:val="center"/>
           </w:tcPr>
           <w:p>
@@ -3144,7 +2571,7 @@
         <w:tc>
           <w:tcPr>
             <w:tcW w:type="dxa" w:w="9936"/>
-            <w:gridSpan w:val="4"/>
+            <w:gridSpan w:val="3"/>
             <w:vAlign w:val="center"/>
             <w:shd w:val="clear" w:color="auto" w:fill="F2F2F2"/>
           </w:tcPr>
@@ -3172,28 +2599,7 @@
         </w:trPr>
         <w:tc>
           <w:tcPr>
-            <w:tcW w:type="dxa" w:w="1584"/>
-            <w:vAlign w:val="center"/>
-          </w:tcPr>
-          <w:p>
-            <w:pPr>
-              <w:spacing w:after="20" w:before="20"/>
-            </w:pPr>
-            <w:r/>
-            <w:r>
-              <w:rPr>
-                <w:b/>
-                <w:i w:val="0"/>
-                <w:color w:val="262626"/>
-                <w:sz w:val="17"/>
-              </w:rPr>
-              <w:t>TOOLS_​clear</w:t>
-            </w:r>
-          </w:p>
-        </w:tc>
-        <w:tc>
-          <w:tcPr>
-            <w:tcW w:type="dxa" w:w="4464"/>
+            <w:tcW w:type="dxa" w:w="5328"/>
             <w:vAlign w:val="center"/>
           </w:tcPr>
           <w:p>
@@ -3235,7 +2641,7 @@
         </w:tc>
         <w:tc>
           <w:tcPr>
-            <w:tcW w:type="dxa" w:w="2016"/>
+            <w:tcW w:type="dxa" w:w="2736"/>
             <w:vAlign w:val="center"/>
           </w:tcPr>
           <w:p>
@@ -3260,28 +2666,7 @@
         </w:trPr>
         <w:tc>
           <w:tcPr>
-            <w:tcW w:type="dxa" w:w="1584"/>
-            <w:vAlign w:val="center"/>
-          </w:tcPr>
-          <w:p>
-            <w:pPr>
-              <w:spacing w:after="20" w:before="20"/>
-            </w:pPr>
-            <w:r/>
-            <w:r>
-              <w:rPr>
-                <w:b/>
-                <w:i w:val="0"/>
-                <w:color w:val="262626"/>
-                <w:sz w:val="17"/>
-              </w:rPr>
-              <w:t>TOOLS_​thoughtful</w:t>
-            </w:r>
-          </w:p>
-        </w:tc>
-        <w:tc>
-          <w:tcPr>
-            <w:tcW w:type="dxa" w:w="4464"/>
+            <w:tcW w:type="dxa" w:w="5328"/>
             <w:vAlign w:val="center"/>
           </w:tcPr>
           <w:p>
@@ -3323,7 +2708,7 @@
         </w:tc>
         <w:tc>
           <w:tcPr>
-            <w:tcW w:type="dxa" w:w="2016"/>
+            <w:tcW w:type="dxa" w:w="2736"/>
             <w:vAlign w:val="center"/>
           </w:tcPr>
           <w:p>
@@ -3348,28 +2733,7 @@
         </w:trPr>
         <w:tc>
           <w:tcPr>
-            <w:tcW w:type="dxa" w:w="1584"/>
-            <w:vAlign w:val="center"/>
-          </w:tcPr>
-          <w:p>
-            <w:pPr>
-              <w:spacing w:after="20" w:before="20"/>
-            </w:pPr>
-            <w:r/>
-            <w:r>
-              <w:rPr>
-                <w:b/>
-                <w:i w:val="0"/>
-                <w:color w:val="262626"/>
-                <w:sz w:val="17"/>
-              </w:rPr>
-              <w:t>TOOLS_​open</w:t>
-            </w:r>
-          </w:p>
-        </w:tc>
-        <w:tc>
-          <w:tcPr>
-            <w:tcW w:type="dxa" w:w="4464"/>
+            <w:tcW w:type="dxa" w:w="5328"/>
             <w:vAlign w:val="center"/>
           </w:tcPr>
           <w:p>
@@ -3411,7 +2775,7 @@
         </w:tc>
         <w:tc>
           <w:tcPr>
-            <w:tcW w:type="dxa" w:w="2016"/>
+            <w:tcW w:type="dxa" w:w="2736"/>
             <w:vAlign w:val="center"/>
           </w:tcPr>
           <w:p>
@@ -3492,10 +2856,9 @@
         </w:tblBorders>
       </w:tblPr>
       <w:tblGrid>
-        <w:gridCol w:w="1584"/>
-        <w:gridCol w:w="4464"/>
+        <w:gridCol w:w="5328"/>
         <w:gridCol w:w="1872"/>
-        <w:gridCol w:w="2016"/>
+        <w:gridCol w:w="2736"/>
       </w:tblGrid>
       <w:tr>
         <w:trPr>
@@ -3504,29 +2867,7 @@
         </w:trPr>
         <w:tc>
           <w:tcPr>
-            <w:tcW w:type="dxa" w:w="1584"/>
-            <w:vAlign w:val="center"/>
-            <w:shd w:val="clear" w:color="auto" w:fill="DCE6F1"/>
-          </w:tcPr>
-          <w:p>
-            <w:pPr>
-              <w:spacing w:after="20" w:before="20"/>
-            </w:pPr>
-            <w:r/>
-            <w:r>
-              <w:rPr>
-                <w:b/>
-                <w:i w:val="0"/>
-                <w:color w:val="1F3864"/>
-                <w:sz w:val="20"/>
-              </w:rPr>
-              <w:t>Code</w:t>
-            </w:r>
-          </w:p>
-        </w:tc>
-        <w:tc>
-          <w:tcPr>
-            <w:tcW w:type="dxa" w:w="4464"/>
+            <w:tcW w:type="dxa" w:w="5328"/>
             <w:vAlign w:val="center"/>
             <w:shd w:val="clear" w:color="auto" w:fill="DCE6F1"/>
           </w:tcPr>
@@ -3570,7 +2911,7 @@
         </w:tc>
         <w:tc>
           <w:tcPr>
-            <w:tcW w:type="dxa" w:w="2016"/>
+            <w:tcW w:type="dxa" w:w="2736"/>
             <w:vAlign w:val="center"/>
             <w:shd w:val="clear" w:color="auto" w:fill="DCE6F1"/>
           </w:tcPr>
@@ -3598,7 +2939,7 @@
         <w:tc>
           <w:tcPr>
             <w:tcW w:type="dxa" w:w="9936"/>
-            <w:gridSpan w:val="4"/>
+            <w:gridSpan w:val="3"/>
             <w:vAlign w:val="center"/>
             <w:shd w:val="clear" w:color="auto" w:fill="F2F2F2"/>
           </w:tcPr>
@@ -3626,28 +2967,7 @@
         </w:trPr>
         <w:tc>
           <w:tcPr>
-            <w:tcW w:type="dxa" w:w="1584"/>
-            <w:vAlign w:val="center"/>
-          </w:tcPr>
-          <w:p>
-            <w:pPr>
-              <w:spacing w:after="20" w:before="20"/>
-            </w:pPr>
-            <w:r/>
-            <w:r>
-              <w:rPr>
-                <w:b/>
-                <w:i w:val="0"/>
-                <w:color w:val="262626"/>
-                <w:sz w:val="17"/>
-              </w:rPr>
-              <w:t>LI1</w:t>
-            </w:r>
-          </w:p>
-        </w:tc>
-        <w:tc>
-          <w:tcPr>
-            <w:tcW w:type="dxa" w:w="4464"/>
+            <w:tcW w:type="dxa" w:w="5328"/>
             <w:vAlign w:val="center"/>
           </w:tcPr>
           <w:p>
@@ -3689,7 +3009,7 @@
         </w:tc>
         <w:tc>
           <w:tcPr>
-            <w:tcW w:type="dxa" w:w="2016"/>
+            <w:tcW w:type="dxa" w:w="2736"/>
             <w:vAlign w:val="center"/>
           </w:tcPr>
           <w:p>
@@ -3714,28 +3034,7 @@
         </w:trPr>
         <w:tc>
           <w:tcPr>
-            <w:tcW w:type="dxa" w:w="1584"/>
-            <w:vAlign w:val="center"/>
-          </w:tcPr>
-          <w:p>
-            <w:pPr>
-              <w:spacing w:after="20" w:before="20"/>
-            </w:pPr>
-            <w:r/>
-            <w:r>
-              <w:rPr>
-                <w:b/>
-                <w:i w:val="0"/>
-                <w:color w:val="262626"/>
-                <w:sz w:val="17"/>
-              </w:rPr>
-              <w:t>LI2</w:t>
-            </w:r>
-          </w:p>
-        </w:tc>
-        <w:tc>
-          <w:tcPr>
-            <w:tcW w:type="dxa" w:w="4464"/>
+            <w:tcW w:type="dxa" w:w="5328"/>
             <w:vAlign w:val="center"/>
           </w:tcPr>
           <w:p>
@@ -3777,7 +3076,7 @@
         </w:tc>
         <w:tc>
           <w:tcPr>
-            <w:tcW w:type="dxa" w:w="2016"/>
+            <w:tcW w:type="dxa" w:w="2736"/>
             <w:vAlign w:val="center"/>
           </w:tcPr>
           <w:p>
@@ -3802,28 +3101,7 @@
         </w:trPr>
         <w:tc>
           <w:tcPr>
-            <w:tcW w:type="dxa" w:w="1584"/>
-            <w:vAlign w:val="center"/>
-          </w:tcPr>
-          <w:p>
-            <w:pPr>
-              <w:spacing w:after="20" w:before="20"/>
-            </w:pPr>
-            <w:r/>
-            <w:r>
-              <w:rPr>
-                <w:b/>
-                <w:i w:val="0"/>
-                <w:color w:val="262626"/>
-                <w:sz w:val="17"/>
-              </w:rPr>
-              <w:t>LI3</w:t>
-            </w:r>
-          </w:p>
-        </w:tc>
-        <w:tc>
-          <w:tcPr>
-            <w:tcW w:type="dxa" w:w="4464"/>
+            <w:tcW w:type="dxa" w:w="5328"/>
             <w:vAlign w:val="center"/>
           </w:tcPr>
           <w:p>
@@ -3865,7 +3143,7 @@
         </w:tc>
         <w:tc>
           <w:tcPr>
-            <w:tcW w:type="dxa" w:w="2016"/>
+            <w:tcW w:type="dxa" w:w="2736"/>
             <w:vAlign w:val="center"/>
           </w:tcPr>
           <w:p>
@@ -3890,28 +3168,7 @@
         </w:trPr>
         <w:tc>
           <w:tcPr>
-            <w:tcW w:type="dxa" w:w="1584"/>
-            <w:vAlign w:val="center"/>
-          </w:tcPr>
-          <w:p>
-            <w:pPr>
-              <w:spacing w:after="20" w:before="20"/>
-            </w:pPr>
-            <w:r/>
-            <w:r>
-              <w:rPr>
-                <w:b/>
-                <w:i w:val="0"/>
-                <w:color w:val="262626"/>
-                <w:sz w:val="17"/>
-              </w:rPr>
-              <w:t>LI4</w:t>
-            </w:r>
-          </w:p>
-        </w:tc>
-        <w:tc>
-          <w:tcPr>
-            <w:tcW w:type="dxa" w:w="4464"/>
+            <w:tcW w:type="dxa" w:w="5328"/>
             <w:vAlign w:val="center"/>
           </w:tcPr>
           <w:p>
@@ -3953,7 +3210,7 @@
         </w:tc>
         <w:tc>
           <w:tcPr>
-            <w:tcW w:type="dxa" w:w="2016"/>
+            <w:tcW w:type="dxa" w:w="2736"/>
             <w:vAlign w:val="center"/>
           </w:tcPr>
           <w:p>
@@ -3979,7 +3236,7 @@
         <w:tc>
           <w:tcPr>
             <w:tcW w:type="dxa" w:w="9936"/>
-            <w:gridSpan w:val="4"/>
+            <w:gridSpan w:val="3"/>
             <w:vAlign w:val="center"/>
             <w:shd w:val="clear" w:color="auto" w:fill="F2F2F2"/>
           </w:tcPr>
@@ -4007,28 +3264,7 @@
         </w:trPr>
         <w:tc>
           <w:tcPr>
-            <w:tcW w:type="dxa" w:w="1584"/>
-            <w:vAlign w:val="center"/>
-          </w:tcPr>
-          <w:p>
-            <w:pPr>
-              <w:spacing w:after="20" w:before="20"/>
-            </w:pPr>
-            <w:r/>
-            <w:r>
-              <w:rPr>
-                <w:b/>
-                <w:i w:val="0"/>
-                <w:color w:val="262626"/>
-                <w:sz w:val="17"/>
-              </w:rPr>
-              <w:t>DS1</w:t>
-            </w:r>
-          </w:p>
-        </w:tc>
-        <w:tc>
-          <w:tcPr>
-            <w:tcW w:type="dxa" w:w="4464"/>
+            <w:tcW w:type="dxa" w:w="5328"/>
             <w:vAlign w:val="center"/>
           </w:tcPr>
           <w:p>
@@ -4070,7 +3306,7 @@
         </w:tc>
         <w:tc>
           <w:tcPr>
-            <w:tcW w:type="dxa" w:w="2016"/>
+            <w:tcW w:type="dxa" w:w="2736"/>
             <w:vAlign w:val="center"/>
           </w:tcPr>
           <w:p>
@@ -4095,28 +3331,7 @@
         </w:trPr>
         <w:tc>
           <w:tcPr>
-            <w:tcW w:type="dxa" w:w="1584"/>
-            <w:vAlign w:val="center"/>
-          </w:tcPr>
-          <w:p>
-            <w:pPr>
-              <w:spacing w:after="20" w:before="20"/>
-            </w:pPr>
-            <w:r/>
-            <w:r>
-              <w:rPr>
-                <w:b/>
-                <w:i w:val="0"/>
-                <w:color w:val="262626"/>
-                <w:sz w:val="17"/>
-              </w:rPr>
-              <w:t>DS2</w:t>
-            </w:r>
-          </w:p>
-        </w:tc>
-        <w:tc>
-          <w:tcPr>
-            <w:tcW w:type="dxa" w:w="4464"/>
+            <w:tcW w:type="dxa" w:w="5328"/>
             <w:vAlign w:val="center"/>
           </w:tcPr>
           <w:p>
@@ -4158,7 +3373,7 @@
         </w:tc>
         <w:tc>
           <w:tcPr>
-            <w:tcW w:type="dxa" w:w="2016"/>
+            <w:tcW w:type="dxa" w:w="2736"/>
             <w:vAlign w:val="center"/>
           </w:tcPr>
           <w:p>
@@ -4183,28 +3398,7 @@
         </w:trPr>
         <w:tc>
           <w:tcPr>
-            <w:tcW w:type="dxa" w:w="1584"/>
-            <w:vAlign w:val="center"/>
-          </w:tcPr>
-          <w:p>
-            <w:pPr>
-              <w:spacing w:after="20" w:before="20"/>
-            </w:pPr>
-            <w:r/>
-            <w:r>
-              <w:rPr>
-                <w:b/>
-                <w:i w:val="0"/>
-                <w:color w:val="262626"/>
-                <w:sz w:val="17"/>
-              </w:rPr>
-              <w:t>DS4</w:t>
-            </w:r>
-          </w:p>
-        </w:tc>
-        <w:tc>
-          <w:tcPr>
-            <w:tcW w:type="dxa" w:w="4464"/>
+            <w:tcW w:type="dxa" w:w="5328"/>
             <w:vAlign w:val="center"/>
           </w:tcPr>
           <w:p>
@@ -4246,7 +3440,7 @@
         </w:tc>
         <w:tc>
           <w:tcPr>
-            <w:tcW w:type="dxa" w:w="2016"/>
+            <w:tcW w:type="dxa" w:w="2736"/>
             <w:vAlign w:val="center"/>
           </w:tcPr>
           <w:p>
@@ -4272,7 +3466,7 @@
         <w:tc>
           <w:tcPr>
             <w:tcW w:type="dxa" w:w="9936"/>
-            <w:gridSpan w:val="4"/>
+            <w:gridSpan w:val="3"/>
             <w:vAlign w:val="center"/>
             <w:shd w:val="clear" w:color="auto" w:fill="F2F2F2"/>
           </w:tcPr>
@@ -4300,28 +3494,7 @@
         </w:trPr>
         <w:tc>
           <w:tcPr>
-            <w:tcW w:type="dxa" w:w="1584"/>
-            <w:vAlign w:val="center"/>
-          </w:tcPr>
-          <w:p>
-            <w:pPr>
-              <w:spacing w:after="20" w:before="20"/>
-            </w:pPr>
-            <w:r/>
-            <w:r>
-              <w:rPr>
-                <w:b/>
-                <w:i w:val="0"/>
-                <w:color w:val="262626"/>
-                <w:sz w:val="17"/>
-              </w:rPr>
-              <w:t>DR1 (R)</w:t>
-            </w:r>
-          </w:p>
-        </w:tc>
-        <w:tc>
-          <w:tcPr>
-            <w:tcW w:type="dxa" w:w="4464"/>
+            <w:tcW w:type="dxa" w:w="5328"/>
             <w:vAlign w:val="center"/>
           </w:tcPr>
           <w:p>
@@ -4357,13 +3530,13 @@
                 <w:color w:val="262626"/>
                 <w:sz w:val="19"/>
               </w:rPr>
-              <w:t>1–7 agreement</w:t>
+              <w:t>1–7 agreement (R)</w:t>
             </w:r>
           </w:p>
         </w:tc>
         <w:tc>
           <w:tcPr>
-            <w:tcW w:type="dxa" w:w="2016"/>
+            <w:tcW w:type="dxa" w:w="2736"/>
             <w:vAlign w:val="center"/>
           </w:tcPr>
           <w:p>
@@ -4388,28 +3561,7 @@
         </w:trPr>
         <w:tc>
           <w:tcPr>
-            <w:tcW w:type="dxa" w:w="1584"/>
-            <w:vAlign w:val="center"/>
-          </w:tcPr>
-          <w:p>
-            <w:pPr>
-              <w:spacing w:after="20" w:before="20"/>
-            </w:pPr>
-            <w:r/>
-            <w:r>
-              <w:rPr>
-                <w:b/>
-                <w:i w:val="0"/>
-                <w:color w:val="262626"/>
-                <w:sz w:val="17"/>
-              </w:rPr>
-              <w:t>DR2 (R)</w:t>
-            </w:r>
-          </w:p>
-        </w:tc>
-        <w:tc>
-          <w:tcPr>
-            <w:tcW w:type="dxa" w:w="4464"/>
+            <w:tcW w:type="dxa" w:w="5328"/>
             <w:vAlign w:val="center"/>
           </w:tcPr>
           <w:p>
@@ -4445,13 +3597,13 @@
                 <w:color w:val="262626"/>
                 <w:sz w:val="19"/>
               </w:rPr>
-              <w:t>1–7 agreement</w:t>
+              <w:t>1–7 agreement (R)</w:t>
             </w:r>
           </w:p>
         </w:tc>
         <w:tc>
           <w:tcPr>
-            <w:tcW w:type="dxa" w:w="2016"/>
+            <w:tcW w:type="dxa" w:w="2736"/>
             <w:vAlign w:val="center"/>
           </w:tcPr>
           <w:p>
@@ -4476,28 +3628,7 @@
         </w:trPr>
         <w:tc>
           <w:tcPr>
-            <w:tcW w:type="dxa" w:w="1584"/>
-            <w:vAlign w:val="center"/>
-          </w:tcPr>
-          <w:p>
-            <w:pPr>
-              <w:spacing w:after="20" w:before="20"/>
-            </w:pPr>
-            <w:r/>
-            <w:r>
-              <w:rPr>
-                <w:b/>
-                <w:i w:val="0"/>
-                <w:color w:val="262626"/>
-                <w:sz w:val="17"/>
-              </w:rPr>
-              <w:t>DR3</w:t>
-            </w:r>
-          </w:p>
-        </w:tc>
-        <w:tc>
-          <w:tcPr>
-            <w:tcW w:type="dxa" w:w="4464"/>
+            <w:tcW w:type="dxa" w:w="5328"/>
             <w:vAlign w:val="center"/>
           </w:tcPr>
           <w:p>
@@ -4539,7 +3670,7 @@
         </w:tc>
         <w:tc>
           <w:tcPr>
-            <w:tcW w:type="dxa" w:w="2016"/>
+            <w:tcW w:type="dxa" w:w="2736"/>
             <w:vAlign w:val="center"/>
           </w:tcPr>
           <w:p>
@@ -4564,28 +3695,7 @@
         </w:trPr>
         <w:tc>
           <w:tcPr>
-            <w:tcW w:type="dxa" w:w="1584"/>
-            <w:vAlign w:val="center"/>
-          </w:tcPr>
-          <w:p>
-            <w:pPr>
-              <w:spacing w:after="20" w:before="20"/>
-            </w:pPr>
-            <w:r/>
-            <w:r>
-              <w:rPr>
-                <w:b/>
-                <w:i w:val="0"/>
-                <w:color w:val="262626"/>
-                <w:sz w:val="17"/>
-              </w:rPr>
-              <w:t>DR4 (R)</w:t>
-            </w:r>
-          </w:p>
-        </w:tc>
-        <w:tc>
-          <w:tcPr>
-            <w:tcW w:type="dxa" w:w="4464"/>
+            <w:tcW w:type="dxa" w:w="5328"/>
             <w:vAlign w:val="center"/>
           </w:tcPr>
           <w:p>
@@ -4621,13 +3731,13 @@
                 <w:color w:val="262626"/>
                 <w:sz w:val="19"/>
               </w:rPr>
-              <w:t>1–7 agreement</w:t>
+              <w:t>1–7 agreement (R)</w:t>
             </w:r>
           </w:p>
         </w:tc>
         <w:tc>
           <w:tcPr>
-            <w:tcW w:type="dxa" w:w="2016"/>
+            <w:tcW w:type="dxa" w:w="2736"/>
             <w:vAlign w:val="center"/>
           </w:tcPr>
           <w:p>
@@ -4653,7 +3763,7 @@
         <w:tc>
           <w:tcPr>
             <w:tcW w:type="dxa" w:w="9936"/>
-            <w:gridSpan w:val="4"/>
+            <w:gridSpan w:val="3"/>
             <w:vAlign w:val="center"/>
             <w:shd w:val="clear" w:color="auto" w:fill="F2F2F2"/>
           </w:tcPr>
@@ -4681,28 +3791,7 @@
         </w:trPr>
         <w:tc>
           <w:tcPr>
-            <w:tcW w:type="dxa" w:w="1584"/>
-            <w:vAlign w:val="center"/>
-          </w:tcPr>
-          <w:p>
-            <w:pPr>
-              <w:spacing w:after="20" w:before="20"/>
-            </w:pPr>
-            <w:r/>
-            <w:r>
-              <w:rPr>
-                <w:b/>
-                <w:i w:val="0"/>
-                <w:color w:val="262626"/>
-                <w:sz w:val="17"/>
-              </w:rPr>
-              <w:t>VC1</w:t>
-            </w:r>
-          </w:p>
-        </w:tc>
-        <w:tc>
-          <w:tcPr>
-            <w:tcW w:type="dxa" w:w="4464"/>
+            <w:tcW w:type="dxa" w:w="5328"/>
             <w:vAlign w:val="center"/>
           </w:tcPr>
           <w:p>
@@ -4744,7 +3833,7 @@
         </w:tc>
         <w:tc>
           <w:tcPr>
-            <w:tcW w:type="dxa" w:w="2016"/>
+            <w:tcW w:type="dxa" w:w="2736"/>
             <w:vAlign w:val="center"/>
           </w:tcPr>
           <w:p>
@@ -4769,28 +3858,7 @@
         </w:trPr>
         <w:tc>
           <w:tcPr>
-            <w:tcW w:type="dxa" w:w="1584"/>
-            <w:vAlign w:val="center"/>
-          </w:tcPr>
-          <w:p>
-            <w:pPr>
-              <w:spacing w:after="20" w:before="20"/>
-            </w:pPr>
-            <w:r/>
-            <w:r>
-              <w:rPr>
-                <w:b/>
-                <w:i w:val="0"/>
-                <w:color w:val="262626"/>
-                <w:sz w:val="17"/>
-              </w:rPr>
-              <w:t>VC2</w:t>
-            </w:r>
-          </w:p>
-        </w:tc>
-        <w:tc>
-          <w:tcPr>
-            <w:tcW w:type="dxa" w:w="4464"/>
+            <w:tcW w:type="dxa" w:w="5328"/>
             <w:vAlign w:val="center"/>
           </w:tcPr>
           <w:p>
@@ -4832,7 +3900,7 @@
         </w:tc>
         <w:tc>
           <w:tcPr>
-            <w:tcW w:type="dxa" w:w="2016"/>
+            <w:tcW w:type="dxa" w:w="2736"/>
             <w:vAlign w:val="center"/>
           </w:tcPr>
           <w:p>
@@ -4858,7 +3926,7 @@
         <w:tc>
           <w:tcPr>
             <w:tcW w:type="dxa" w:w="9936"/>
-            <w:gridSpan w:val="4"/>
+            <w:gridSpan w:val="3"/>
             <w:vAlign w:val="center"/>
             <w:shd w:val="clear" w:color="auto" w:fill="F2F2F2"/>
           </w:tcPr>
@@ -4886,28 +3954,7 @@
         </w:trPr>
         <w:tc>
           <w:tcPr>
-            <w:tcW w:type="dxa" w:w="1584"/>
-            <w:vAlign w:val="center"/>
-          </w:tcPr>
-          <w:p>
-            <w:pPr>
-              <w:spacing w:after="20" w:before="20"/>
-            </w:pPr>
-            <w:r/>
-            <w:r>
-              <w:rPr>
-                <w:b/>
-                <w:i w:val="0"/>
-                <w:color w:val="262626"/>
-                <w:sz w:val="17"/>
-              </w:rPr>
-              <w:t>DC1</w:t>
-            </w:r>
-          </w:p>
-        </w:tc>
-        <w:tc>
-          <w:tcPr>
-            <w:tcW w:type="dxa" w:w="4464"/>
+            <w:tcW w:type="dxa" w:w="5328"/>
             <w:vAlign w:val="center"/>
           </w:tcPr>
           <w:p>
@@ -4949,7 +3996,7 @@
         </w:tc>
         <w:tc>
           <w:tcPr>
-            <w:tcW w:type="dxa" w:w="2016"/>
+            <w:tcW w:type="dxa" w:w="2736"/>
             <w:vAlign w:val="center"/>
           </w:tcPr>
           <w:p>
@@ -4974,28 +4021,7 @@
         </w:trPr>
         <w:tc>
           <w:tcPr>
-            <w:tcW w:type="dxa" w:w="1584"/>
-            <w:vAlign w:val="center"/>
-          </w:tcPr>
-          <w:p>
-            <w:pPr>
-              <w:spacing w:after="20" w:before="20"/>
-            </w:pPr>
-            <w:r/>
-            <w:r>
-              <w:rPr>
-                <w:b/>
-                <w:i w:val="0"/>
-                <w:color w:val="262626"/>
-                <w:sz w:val="17"/>
-              </w:rPr>
-              <w:t>DC2</w:t>
-            </w:r>
-          </w:p>
-        </w:tc>
-        <w:tc>
-          <w:tcPr>
-            <w:tcW w:type="dxa" w:w="4464"/>
+            <w:tcW w:type="dxa" w:w="5328"/>
             <w:vAlign w:val="center"/>
           </w:tcPr>
           <w:p>
@@ -5037,7 +4063,7 @@
         </w:tc>
         <w:tc>
           <w:tcPr>
-            <w:tcW w:type="dxa" w:w="2016"/>
+            <w:tcW w:type="dxa" w:w="2736"/>
             <w:vAlign w:val="center"/>
           </w:tcPr>
           <w:p>
@@ -5063,7 +4089,7 @@
         <w:tc>
           <w:tcPr>
             <w:tcW w:type="dxa" w:w="9936"/>
-            <w:gridSpan w:val="4"/>
+            <w:gridSpan w:val="3"/>
             <w:vAlign w:val="center"/>
             <w:shd w:val="clear" w:color="auto" w:fill="F2F2F2"/>
           </w:tcPr>
@@ -5091,28 +4117,7 @@
         </w:trPr>
         <w:tc>
           <w:tcPr>
-            <w:tcW w:type="dxa" w:w="1584"/>
-            <w:vAlign w:val="center"/>
-          </w:tcPr>
-          <w:p>
-            <w:pPr>
-              <w:spacing w:after="20" w:before="20"/>
-            </w:pPr>
-            <w:r/>
-            <w:r>
-              <w:rPr>
-                <w:b/>
-                <w:i w:val="0"/>
-                <w:color w:val="262626"/>
-                <w:sz w:val="17"/>
-              </w:rPr>
-              <w:t>CB1 (R)</w:t>
-            </w:r>
-          </w:p>
-        </w:tc>
-        <w:tc>
-          <w:tcPr>
-            <w:tcW w:type="dxa" w:w="4464"/>
+            <w:tcW w:type="dxa" w:w="5328"/>
             <w:vAlign w:val="center"/>
           </w:tcPr>
           <w:p>
@@ -5148,13 +4153,13 @@
                 <w:color w:val="262626"/>
                 <w:sz w:val="19"/>
               </w:rPr>
-              <w:t>1–7 agreement</w:t>
+              <w:t>1–7 agreement (R)</w:t>
             </w:r>
           </w:p>
         </w:tc>
         <w:tc>
           <w:tcPr>
-            <w:tcW w:type="dxa" w:w="2016"/>
+            <w:tcW w:type="dxa" w:w="2736"/>
             <w:vAlign w:val="center"/>
           </w:tcPr>
           <w:p>
@@ -5179,28 +4184,7 @@
         </w:trPr>
         <w:tc>
           <w:tcPr>
-            <w:tcW w:type="dxa" w:w="1584"/>
-            <w:vAlign w:val="center"/>
-          </w:tcPr>
-          <w:p>
-            <w:pPr>
-              <w:spacing w:after="20" w:before="20"/>
-            </w:pPr>
-            <w:r/>
-            <w:r>
-              <w:rPr>
-                <w:b/>
-                <w:i w:val="0"/>
-                <w:color w:val="262626"/>
-                <w:sz w:val="17"/>
-              </w:rPr>
-              <w:t>CB2 (R)</w:t>
-            </w:r>
-          </w:p>
-        </w:tc>
-        <w:tc>
-          <w:tcPr>
-            <w:tcW w:type="dxa" w:w="4464"/>
+            <w:tcW w:type="dxa" w:w="5328"/>
             <w:vAlign w:val="center"/>
           </w:tcPr>
           <w:p>
@@ -5236,13 +4220,13 @@
                 <w:color w:val="262626"/>
                 <w:sz w:val="19"/>
               </w:rPr>
-              <w:t>1–7 agreement</w:t>
+              <w:t>1–7 agreement (R)</w:t>
             </w:r>
           </w:p>
         </w:tc>
         <w:tc>
           <w:tcPr>
-            <w:tcW w:type="dxa" w:w="2016"/>
+            <w:tcW w:type="dxa" w:w="2736"/>
             <w:vAlign w:val="center"/>
           </w:tcPr>
           <w:p>
@@ -5267,28 +4251,7 @@
         </w:trPr>
         <w:tc>
           <w:tcPr>
-            <w:tcW w:type="dxa" w:w="1584"/>
-            <w:vAlign w:val="center"/>
-          </w:tcPr>
-          <w:p>
-            <w:pPr>
-              <w:spacing w:after="20" w:before="20"/>
-            </w:pPr>
-            <w:r/>
-            <w:r>
-              <w:rPr>
-                <w:b/>
-                <w:i w:val="0"/>
-                <w:color w:val="262626"/>
-                <w:sz w:val="17"/>
-              </w:rPr>
-              <w:t>CB3 (R)</w:t>
-            </w:r>
-          </w:p>
-        </w:tc>
-        <w:tc>
-          <w:tcPr>
-            <w:tcW w:type="dxa" w:w="4464"/>
+            <w:tcW w:type="dxa" w:w="5328"/>
             <w:vAlign w:val="center"/>
           </w:tcPr>
           <w:p>
@@ -5324,13 +4287,13 @@
                 <w:color w:val="262626"/>
                 <w:sz w:val="19"/>
               </w:rPr>
-              <w:t>1–7 agreement</w:t>
+              <w:t>1–7 agreement (R)</w:t>
             </w:r>
           </w:p>
         </w:tc>
         <w:tc>
           <w:tcPr>
-            <w:tcW w:type="dxa" w:w="2016"/>
+            <w:tcW w:type="dxa" w:w="2736"/>
             <w:vAlign w:val="center"/>
           </w:tcPr>
           <w:p>
@@ -5356,7 +4319,7 @@
         <w:tc>
           <w:tcPr>
             <w:tcW w:type="dxa" w:w="9936"/>
-            <w:gridSpan w:val="4"/>
+            <w:gridSpan w:val="3"/>
             <w:vAlign w:val="center"/>
             <w:shd w:val="clear" w:color="auto" w:fill="F2F2F2"/>
           </w:tcPr>
@@ -5384,28 +4347,7 @@
         </w:trPr>
         <w:tc>
           <w:tcPr>
-            <w:tcW w:type="dxa" w:w="1584"/>
-            <w:vAlign w:val="center"/>
-          </w:tcPr>
-          <w:p>
-            <w:pPr>
-              <w:spacing w:after="20" w:before="20"/>
-            </w:pPr>
-            <w:r/>
-            <w:r>
-              <w:rPr>
-                <w:b/>
-                <w:i w:val="0"/>
-                <w:color w:val="262626"/>
-                <w:sz w:val="17"/>
-              </w:rPr>
-              <w:t>SA1</w:t>
-            </w:r>
-          </w:p>
-        </w:tc>
-        <w:tc>
-          <w:tcPr>
-            <w:tcW w:type="dxa" w:w="4464"/>
+            <w:tcW w:type="dxa" w:w="5328"/>
             <w:vAlign w:val="center"/>
           </w:tcPr>
           <w:p>
@@ -5447,7 +4389,7 @@
         </w:tc>
         <w:tc>
           <w:tcPr>
-            <w:tcW w:type="dxa" w:w="2016"/>
+            <w:tcW w:type="dxa" w:w="2736"/>
             <w:vAlign w:val="center"/>
           </w:tcPr>
           <w:p>
@@ -5472,28 +4414,7 @@
         </w:trPr>
         <w:tc>
           <w:tcPr>
-            <w:tcW w:type="dxa" w:w="1584"/>
-            <w:vAlign w:val="center"/>
-          </w:tcPr>
-          <w:p>
-            <w:pPr>
-              <w:spacing w:after="20" w:before="20"/>
-            </w:pPr>
-            <w:r/>
-            <w:r>
-              <w:rPr>
-                <w:b/>
-                <w:i w:val="0"/>
-                <w:color w:val="262626"/>
-                <w:sz w:val="17"/>
-              </w:rPr>
-              <w:t>SA2</w:t>
-            </w:r>
-          </w:p>
-        </w:tc>
-        <w:tc>
-          <w:tcPr>
-            <w:tcW w:type="dxa" w:w="4464"/>
+            <w:tcW w:type="dxa" w:w="5328"/>
             <w:vAlign w:val="center"/>
           </w:tcPr>
           <w:p>
@@ -5535,7 +4456,7 @@
         </w:tc>
         <w:tc>
           <w:tcPr>
-            <w:tcW w:type="dxa" w:w="2016"/>
+            <w:tcW w:type="dxa" w:w="2736"/>
             <w:vAlign w:val="center"/>
           </w:tcPr>
           <w:p>
@@ -5560,28 +4481,7 @@
         </w:trPr>
         <w:tc>
           <w:tcPr>
-            <w:tcW w:type="dxa" w:w="1584"/>
-            <w:vAlign w:val="center"/>
-          </w:tcPr>
-          <w:p>
-            <w:pPr>
-              <w:spacing w:after="20" w:before="20"/>
-            </w:pPr>
-            <w:r/>
-            <w:r>
-              <w:rPr>
-                <w:b/>
-                <w:i w:val="0"/>
-                <w:color w:val="262626"/>
-                <w:sz w:val="17"/>
-              </w:rPr>
-              <w:t>SA3</w:t>
-            </w:r>
-          </w:p>
-        </w:tc>
-        <w:tc>
-          <w:tcPr>
-            <w:tcW w:type="dxa" w:w="4464"/>
+            <w:tcW w:type="dxa" w:w="5328"/>
             <w:vAlign w:val="center"/>
           </w:tcPr>
           <w:p>
@@ -5623,7 +4523,7 @@
         </w:tc>
         <w:tc>
           <w:tcPr>
-            <w:tcW w:type="dxa" w:w="2016"/>
+            <w:tcW w:type="dxa" w:w="2736"/>
             <w:vAlign w:val="center"/>
           </w:tcPr>
           <w:p>
@@ -5649,7 +4549,7 @@
         <w:tc>
           <w:tcPr>
             <w:tcW w:type="dxa" w:w="9936"/>
-            <w:gridSpan w:val="4"/>
+            <w:gridSpan w:val="3"/>
             <w:vAlign w:val="center"/>
             <w:shd w:val="clear" w:color="auto" w:fill="F2F2F2"/>
           </w:tcPr>
@@ -5677,28 +4577,7 @@
         </w:trPr>
         <w:tc>
           <w:tcPr>
-            <w:tcW w:type="dxa" w:w="1584"/>
-            <w:vAlign w:val="center"/>
-          </w:tcPr>
-          <w:p>
-            <w:pPr>
-              <w:spacing w:after="20" w:before="20"/>
-            </w:pPr>
-            <w:r/>
-            <w:r>
-              <w:rPr>
-                <w:b/>
-                <w:i w:val="0"/>
-                <w:color w:val="262626"/>
-                <w:sz w:val="17"/>
-              </w:rPr>
-              <w:t>OW1</w:t>
-            </w:r>
-          </w:p>
-        </w:tc>
-        <w:tc>
-          <w:tcPr>
-            <w:tcW w:type="dxa" w:w="4464"/>
+            <w:tcW w:type="dxa" w:w="5328"/>
             <w:vAlign w:val="center"/>
           </w:tcPr>
           <w:p>
@@ -5740,7 +4619,7 @@
         </w:tc>
         <w:tc>
           <w:tcPr>
-            <w:tcW w:type="dxa" w:w="2016"/>
+            <w:tcW w:type="dxa" w:w="2736"/>
             <w:vAlign w:val="center"/>
           </w:tcPr>
           <w:p>
@@ -5765,28 +4644,7 @@
         </w:trPr>
         <w:tc>
           <w:tcPr>
-            <w:tcW w:type="dxa" w:w="1584"/>
-            <w:vAlign w:val="center"/>
-          </w:tcPr>
-          <w:p>
-            <w:pPr>
-              <w:spacing w:after="20" w:before="20"/>
-            </w:pPr>
-            <w:r/>
-            <w:r>
-              <w:rPr>
-                <w:b/>
-                <w:i w:val="0"/>
-                <w:color w:val="262626"/>
-                <w:sz w:val="17"/>
-              </w:rPr>
-              <w:t>OW2</w:t>
-            </w:r>
-          </w:p>
-        </w:tc>
-        <w:tc>
-          <w:tcPr>
-            <w:tcW w:type="dxa" w:w="4464"/>
+            <w:tcW w:type="dxa" w:w="5328"/>
             <w:vAlign w:val="center"/>
           </w:tcPr>
           <w:p>
@@ -5828,7 +4686,7 @@
         </w:tc>
         <w:tc>
           <w:tcPr>
-            <w:tcW w:type="dxa" w:w="2016"/>
+            <w:tcW w:type="dxa" w:w="2736"/>
             <w:vAlign w:val="center"/>
           </w:tcPr>
           <w:p>
@@ -5853,28 +4711,7 @@
         </w:trPr>
         <w:tc>
           <w:tcPr>
-            <w:tcW w:type="dxa" w:w="1584"/>
-            <w:vAlign w:val="center"/>
-          </w:tcPr>
-          <w:p>
-            <w:pPr>
-              <w:spacing w:after="20" w:before="20"/>
-            </w:pPr>
-            <w:r/>
-            <w:r>
-              <w:rPr>
-                <w:b/>
-                <w:i w:val="0"/>
-                <w:color w:val="262626"/>
-                <w:sz w:val="17"/>
-              </w:rPr>
-              <w:t>OW3</w:t>
-            </w:r>
-          </w:p>
-        </w:tc>
-        <w:tc>
-          <w:tcPr>
-            <w:tcW w:type="dxa" w:w="4464"/>
+            <w:tcW w:type="dxa" w:w="5328"/>
             <w:vAlign w:val="center"/>
           </w:tcPr>
           <w:p>
@@ -5916,7 +4753,7 @@
         </w:tc>
         <w:tc>
           <w:tcPr>
-            <w:tcW w:type="dxa" w:w="2016"/>
+            <w:tcW w:type="dxa" w:w="2736"/>
             <w:vAlign w:val="center"/>
           </w:tcPr>
           <w:p>
@@ -5942,7 +4779,7 @@
         <w:tc>
           <w:tcPr>
             <w:tcW w:type="dxa" w:w="9936"/>
-            <w:gridSpan w:val="4"/>
+            <w:gridSpan w:val="3"/>
             <w:vAlign w:val="center"/>
             <w:shd w:val="clear" w:color="auto" w:fill="F2F2F2"/>
           </w:tcPr>
@@ -5970,28 +4807,7 @@
         </w:trPr>
         <w:tc>
           <w:tcPr>
-            <w:tcW w:type="dxa" w:w="1584"/>
-            <w:vAlign w:val="center"/>
-          </w:tcPr>
-          <w:p>
-            <w:pPr>
-              <w:spacing w:after="20" w:before="20"/>
-            </w:pPr>
-            <w:r/>
-            <w:r>
-              <w:rPr>
-                <w:b/>
-                <w:i w:val="0"/>
-                <w:color w:val="262626"/>
-                <w:sz w:val="17"/>
-              </w:rPr>
-              <w:t>OE_​values</w:t>
-            </w:r>
-          </w:p>
-        </w:tc>
-        <w:tc>
-          <w:tcPr>
-            <w:tcW w:type="dxa" w:w="4464"/>
+            <w:tcW w:type="dxa" w:w="5328"/>
             <w:vAlign w:val="center"/>
           </w:tcPr>
           <w:p>
@@ -6033,7 +4849,7 @@
         </w:tc>
         <w:tc>
           <w:tcPr>
-            <w:tcW w:type="dxa" w:w="2016"/>
+            <w:tcW w:type="dxa" w:w="2736"/>
             <w:vAlign w:val="center"/>
           </w:tcPr>
           <w:p>
@@ -6058,28 +4874,7 @@
         </w:trPr>
         <w:tc>
           <w:tcPr>
-            <w:tcW w:type="dxa" w:w="1584"/>
-            <w:vAlign w:val="center"/>
-          </w:tcPr>
-          <w:p>
-            <w:pPr>
-              <w:spacing w:after="20" w:before="20"/>
-            </w:pPr>
-            <w:r/>
-            <w:r>
-              <w:rPr>
-                <w:b/>
-                <w:i w:val="0"/>
-                <w:color w:val="262626"/>
-                <w:sz w:val="17"/>
-              </w:rPr>
-              <w:t>OE_​change</w:t>
-            </w:r>
-          </w:p>
-        </w:tc>
-        <w:tc>
-          <w:tcPr>
-            <w:tcW w:type="dxa" w:w="4464"/>
+            <w:tcW w:type="dxa" w:w="5328"/>
             <w:vAlign w:val="center"/>
           </w:tcPr>
           <w:p>
@@ -6121,7 +4916,7 @@
         </w:tc>
         <w:tc>
           <w:tcPr>
-            <w:tcW w:type="dxa" w:w="2016"/>
+            <w:tcW w:type="dxa" w:w="2736"/>
             <w:vAlign w:val="center"/>
           </w:tcPr>
           <w:p>
@@ -6146,28 +4941,7 @@
         </w:trPr>
         <w:tc>
           <w:tcPr>
-            <w:tcW w:type="dxa" w:w="1584"/>
-            <w:vAlign w:val="center"/>
-          </w:tcPr>
-          <w:p>
-            <w:pPr>
-              <w:spacing w:after="20" w:before="20"/>
-            </w:pPr>
-            <w:r/>
-            <w:r>
-              <w:rPr>
-                <w:b/>
-                <w:i w:val="0"/>
-                <w:color w:val="262626"/>
-                <w:sz w:val="17"/>
-              </w:rPr>
-              <w:t>OE_​affect</w:t>
-            </w:r>
-          </w:p>
-        </w:tc>
-        <w:tc>
-          <w:tcPr>
-            <w:tcW w:type="dxa" w:w="4464"/>
+            <w:tcW w:type="dxa" w:w="5328"/>
             <w:vAlign w:val="center"/>
           </w:tcPr>
           <w:p>
@@ -6209,7 +4983,7 @@
         </w:tc>
         <w:tc>
           <w:tcPr>
-            <w:tcW w:type="dxa" w:w="2016"/>
+            <w:tcW w:type="dxa" w:w="2736"/>
             <w:vAlign w:val="center"/>
           </w:tcPr>
           <w:p>
@@ -6234,28 +5008,7 @@
         </w:trPr>
         <w:tc>
           <w:tcPr>
-            <w:tcW w:type="dxa" w:w="1584"/>
-            <w:vAlign w:val="center"/>
-          </w:tcPr>
-          <w:p>
-            <w:pPr>
-              <w:spacing w:after="20" w:before="20"/>
-            </w:pPr>
-            <w:r/>
-            <w:r>
-              <w:rPr>
-                <w:b/>
-                <w:i w:val="0"/>
-                <w:color w:val="262626"/>
-                <w:sz w:val="17"/>
-              </w:rPr>
-              <w:t>OE_​regret</w:t>
-            </w:r>
-          </w:p>
-        </w:tc>
-        <w:tc>
-          <w:tcPr>
-            <w:tcW w:type="dxa" w:w="4464"/>
+            <w:tcW w:type="dxa" w:w="5328"/>
             <w:vAlign w:val="center"/>
           </w:tcPr>
           <w:p>
@@ -6297,7 +5050,7 @@
         </w:tc>
         <w:tc>
           <w:tcPr>
-            <w:tcW w:type="dxa" w:w="2016"/>
+            <w:tcW w:type="dxa" w:w="2736"/>
             <w:vAlign w:val="center"/>
           </w:tcPr>
           <w:p>
@@ -6322,28 +5075,7 @@
         </w:trPr>
         <w:tc>
           <w:tcPr>
-            <w:tcW w:type="dxa" w:w="1584"/>
-            <w:vAlign w:val="center"/>
-          </w:tcPr>
-          <w:p>
-            <w:pPr>
-              <w:spacing w:after="20" w:before="20"/>
-            </w:pPr>
-            <w:r/>
-            <w:r>
-              <w:rPr>
-                <w:b/>
-                <w:i w:val="0"/>
-                <w:color w:val="262626"/>
-                <w:sz w:val="17"/>
-              </w:rPr>
-              <w:t>OE_​additional</w:t>
-            </w:r>
-          </w:p>
-        </w:tc>
-        <w:tc>
-          <w:tcPr>
-            <w:tcW w:type="dxa" w:w="4464"/>
+            <w:tcW w:type="dxa" w:w="5328"/>
             <w:vAlign w:val="center"/>
           </w:tcPr>
           <w:p>
@@ -6385,7 +5117,7 @@
         </w:tc>
         <w:tc>
           <w:tcPr>
-            <w:tcW w:type="dxa" w:w="2016"/>
+            <w:tcW w:type="dxa" w:w="2736"/>
             <w:vAlign w:val="center"/>
           </w:tcPr>
           <w:p>
@@ -6594,10 +5326,10 @@
             <w:r/>
             <w:r>
               <w:rPr>
-                <w:b/>
+                <w:b w:val="0"/>
                 <w:i w:val="0"/>
                 <w:color w:val="262626"/>
-                <w:sz w:val="19"/>
+                <w:sz w:val="20"/>
               </w:rPr>
               <w:t>1</w:t>
             </w:r>
@@ -6618,7 +5350,7 @@
                 <w:b w:val="0"/>
                 <w:i w:val="0"/>
                 <w:color w:val="262626"/>
-                <w:sz w:val="20"/>
+                <w:sz w:val="19"/>
               </w:rPr>
             </w:r>
           </w:p>
@@ -6701,10 +5433,10 @@
             <w:r/>
             <w:r>
               <w:rPr>
-                <w:b/>
+                <w:b w:val="0"/>
                 <w:i w:val="0"/>
                 <w:color w:val="262626"/>
-                <w:sz w:val="19"/>
+                <w:sz w:val="20"/>
               </w:rPr>
               <w:t>2</w:t>
             </w:r>
@@ -6725,7 +5457,7 @@
                 <w:b w:val="0"/>
                 <w:i w:val="0"/>
                 <w:color w:val="262626"/>
-                <w:sz w:val="20"/>
+                <w:sz w:val="19"/>
               </w:rPr>
             </w:r>
           </w:p>
@@ -6808,10 +5540,10 @@
             <w:r/>
             <w:r>
               <w:rPr>
-                <w:b/>
+                <w:b w:val="0"/>
                 <w:i w:val="0"/>
                 <w:color w:val="262626"/>
-                <w:sz w:val="19"/>
+                <w:sz w:val="20"/>
               </w:rPr>
               <w:t>3</w:t>
             </w:r>
@@ -6832,7 +5564,7 @@
                 <w:b w:val="0"/>
                 <w:i w:val="0"/>
                 <w:color w:val="262626"/>
-                <w:sz w:val="20"/>
+                <w:sz w:val="19"/>
               </w:rPr>
             </w:r>
           </w:p>
@@ -6915,10 +5647,10 @@
             <w:r/>
             <w:r>
               <w:rPr>
-                <w:b/>
+                <w:b w:val="0"/>
                 <w:i w:val="0"/>
                 <w:color w:val="262626"/>
-                <w:sz w:val="19"/>
+                <w:sz w:val="20"/>
               </w:rPr>
               <w:t>4</w:t>
             </w:r>
@@ -6939,7 +5671,7 @@
                 <w:b w:val="0"/>
                 <w:i w:val="0"/>
                 <w:color w:val="262626"/>
-                <w:sz w:val="20"/>
+                <w:sz w:val="19"/>
               </w:rPr>
             </w:r>
           </w:p>
@@ -7022,10 +5754,10 @@
             <w:r/>
             <w:r>
               <w:rPr>
-                <w:b/>
+                <w:b w:val="0"/>
                 <w:i w:val="0"/>
                 <w:color w:val="262626"/>
-                <w:sz w:val="19"/>
+                <w:sz w:val="20"/>
               </w:rPr>
               <w:t>5</w:t>
             </w:r>
@@ -7046,7 +5778,7 @@
                 <w:b w:val="0"/>
                 <w:i w:val="0"/>
                 <w:color w:val="262626"/>
-                <w:sz w:val="20"/>
+                <w:sz w:val="19"/>
               </w:rPr>
             </w:r>
           </w:p>
@@ -7129,10 +5861,10 @@
             <w:r/>
             <w:r>
               <w:rPr>
-                <w:b/>
+                <w:b w:val="0"/>
                 <w:i w:val="0"/>
                 <w:color w:val="262626"/>
-                <w:sz w:val="19"/>
+                <w:sz w:val="20"/>
               </w:rPr>
               <w:t>6</w:t>
             </w:r>
@@ -7153,7 +5885,7 @@
                 <w:b w:val="0"/>
                 <w:i w:val="0"/>
                 <w:color w:val="262626"/>
-                <w:sz w:val="20"/>
+                <w:sz w:val="19"/>
               </w:rPr>
             </w:r>
           </w:p>
@@ -7236,10 +5968,10 @@
             <w:r/>
             <w:r>
               <w:rPr>
-                <w:b/>
+                <w:b w:val="0"/>
                 <w:i w:val="0"/>
                 <w:color w:val="262626"/>
-                <w:sz w:val="19"/>
+                <w:sz w:val="20"/>
               </w:rPr>
               <w:t>7</w:t>
             </w:r>
@@ -7260,7 +5992,7 @@
                 <w:b w:val="0"/>
                 <w:i w:val="0"/>
                 <w:color w:val="262626"/>
-                <w:sz w:val="20"/>
+                <w:sz w:val="19"/>
               </w:rPr>
             </w:r>
           </w:p>
@@ -7343,10 +6075,10 @@
             <w:r/>
             <w:r>
               <w:rPr>
-                <w:b/>
+                <w:b w:val="0"/>
                 <w:i w:val="0"/>
                 <w:color w:val="262626"/>
-                <w:sz w:val="19"/>
+                <w:sz w:val="20"/>
               </w:rPr>
               <w:t>8</w:t>
             </w:r>
@@ -7367,7 +6099,7 @@
                 <w:b w:val="0"/>
                 <w:i w:val="0"/>
                 <w:color w:val="262626"/>
-                <w:sz w:val="20"/>
+                <w:sz w:val="19"/>
               </w:rPr>
             </w:r>
           </w:p>

</xml_diff>